<commit_message>
Add cosmic-poster HTML dashboard for app.html with evo frames and submission assets.
Replace matplotlib-only poster with segmented CosmicPosterLayout (01-06), fix scroll/brush layout, generate adaptive evolution thumbnails, and refresh figures plus competition docs for submission.

Co-authored-by: Cursor <cursoragent@cursor.com>
</commit_message>
<xml_diff>
--- a/docs/submission/Nyx_answerSheet_filled.docx
+++ b/docs/submission/Nyx_answerSheet_filled.docx
@@ -535,7 +535,7 @@
           <w:b w:val="0"/>
           <w:sz w:val="21"/>
         </w:rPr>
-        <w:t>本任务对Nyx官方128³重子气体密度场进行体渲染展示。数据共100个时间步，小端float32存储，体素线性索引为z→y→x（index=z+128y+128²x）。渲染管线基于vtk.js GPU光线投射，传递函数采用宇宙学预设cosmic：在log域按全域p01–p99映射密度到颜色与不透明度，并启用Phong着色以突出filament脊线。为便于跨时刻对比，选取t=0、25、50、75、99五帧，固定相机位姿与色标范围，以1920×1080分辨率输出体渲染图与五联条带图。</w:t>
+        <w:t>宇宙网诞生记01–02：Nyx官方128³重子气体密度（仅气体，非暗物质），100步t=0…99，小端float32，索引z→y→x。渲染管线基于vtk.js GPU光线投射，传递函数采用宇宙学预设cosmic：在log域按全域p01–p99映射密度到颜色与不透明度，并启用Phong着色以突出filament脊线。为便于跨时刻对比，选取t=0、25、50、75、99五帧，固定相机位姿与色标范围，以1920×1080分辨率输出体渲染图与五联条带图。</w:t>
       </w:r>
     </w:p>
     <w:p>
@@ -2866,7 +2866,7 @@
           <w:b w:val="0"/>
           <w:sz w:val="21"/>
         </w:rPr>
-        <w:t>交互分析页（/app.html）集成log密度直方图（D3.js）与vtk.js体渲染。用户可在直方图上拖拽框选密度区间，或通过快捷按钮选取Top 1%（ρ≥10.7601）与Bottom 1%（ρ≤8.3458）。刷选后传递函数对命中体素高亮，Canvas 2D最大密度投影以金色标出刷选体素；可选3D点云预览（≤12000点）。刷选体素扫描在Web Worker中执行，避免阻塞主线程渲染；相邻时间步idle预取以提升播放流畅度。</w:t>
+        <w:t>交互页v2为三栏：左统计、中体渲染常驻、右刷选（/app.html）。预设Top 1%、90–99%纤维、Bottom 1%；可拖拽框选密度区间。Top 1%：ρ≥10.7601；纤维：ρ∈[9.96,10.76]；Bottom 1%：ρ≤8.3458。刷选后传递函数对命中体素高亮，Canvas 2D最大密度投影以金色标出刷选体素；可选3D点云预览（≤12000点）。刷选体素扫描在Web Worker中执行，避免阻塞主线程渲染；相邻时间步idle预取以提升播放流畅度。</w:t>
       </w:r>
     </w:p>
     <w:p>
@@ -3061,6 +3061,84 @@
                 <w:sz w:val="21"/>
               </w:rPr>
               <w:t>ρ≥10.76</w:t>
+            </w:r>
+          </w:p>
+        </w:tc>
+      </w:tr>
+      <w:tr>
+        <w:tc>
+          <w:tcPr>
+            <w:tcW w:type="dxa" w:w="2436"/>
+          </w:tcPr>
+          <w:p>
+            <w:pPr>
+              <w:spacing w:line="240" w:lineRule="auto"/>
+              <w:jc w:val="center"/>
+            </w:pPr>
+            <w:r>
+              <w:rPr>
+                <w:rFonts w:ascii="宋体" w:hAnsi="宋体" w:eastAsia="宋体"/>
+                <w:b w:val="0"/>
+                <w:sz w:val="21"/>
+              </w:rPr>
+              <w:t>统计→空间</w:t>
+            </w:r>
+          </w:p>
+        </w:tc>
+        <w:tc>
+          <w:tcPr>
+            <w:tcW w:type="dxa" w:w="2436"/>
+          </w:tcPr>
+          <w:p>
+            <w:pPr>
+              <w:spacing w:line="240" w:lineRule="auto"/>
+              <w:jc w:val="center"/>
+            </w:pPr>
+            <w:r>
+              <w:rPr>
+                <w:rFonts w:ascii="宋体" w:hAnsi="宋体" w:eastAsia="宋体"/>
+                <w:b w:val="0"/>
+                <w:sz w:val="21"/>
+              </w:rPr>
+              <w:t>纤维90–99%</w:t>
+            </w:r>
+          </w:p>
+        </w:tc>
+        <w:tc>
+          <w:tcPr>
+            <w:tcW w:type="dxa" w:w="2436"/>
+          </w:tcPr>
+          <w:p>
+            <w:pPr>
+              <w:spacing w:line="240" w:lineRule="auto"/>
+              <w:jc w:val="center"/>
+            </w:pPr>
+            <w:r>
+              <w:rPr>
+                <w:rFonts w:ascii="宋体" w:hAnsi="宋体" w:eastAsia="宋体"/>
+                <w:b w:val="0"/>
+                <w:sz w:val="21"/>
+              </w:rPr>
+              <w:t>亮脊带状</w:t>
+            </w:r>
+          </w:p>
+        </w:tc>
+        <w:tc>
+          <w:tcPr>
+            <w:tcW w:type="dxa" w:w="2436"/>
+          </w:tcPr>
+          <w:p>
+            <w:pPr>
+              <w:spacing w:line="240" w:lineRule="auto"/>
+              <w:jc w:val="center"/>
+            </w:pPr>
+            <w:r>
+              <w:rPr>
+                <w:rFonts w:ascii="宋体" w:hAnsi="宋体" w:eastAsia="宋体"/>
+                <w:b w:val="0"/>
+                <w:sz w:val="21"/>
+              </w:rPr>
+              <w:t>ρ∈[9.96,10.76]</w:t>
             </w:r>
           </w:p>
         </w:tc>

</xml_diff>